<commit_message>
finish commenting on .py file and created TDD.
</commit_message>
<xml_diff>
--- a/EmmanuelLugo_ProgrammingExercise_1/Technical Design Document - EmmanuelLugo__ProgrammingExercise_1.py.docx
+++ b/EmmanuelLugo_ProgrammingExercise_1/Technical Design Document - EmmanuelLugo__ProgrammingExercise_1.py.docx
@@ -27,130 +27,25 @@
     </w:p>
     <w:p>
       <w:r>
-        <w:t xml:space="preserve">This program simulates a ticket sale system. It displays the number of tickets available for purchase and prompts the user to purchase a ticket or tickets. </w:t>
-      </w:r>
-      <w:r>
-        <w:br/>
-      </w:r>
-      <w:r>
-        <w:br/>
-        <w:t xml:space="preserve">This program restricts the customer from entering in any value other than </w:t>
-      </w:r>
-      <w:proofErr w:type="gramStart"/>
-      <w:r>
-        <w:t>and</w:t>
-      </w:r>
-      <w:proofErr w:type="gramEnd"/>
+        <w:t xml:space="preserve">This program simulates a ticket sale system. It displays the number of tickets available for purchase and prompts the user to purchase a ticket or tickets. This program restricts the customer from entering in any value other than </w:t>
+      </w:r>
+      <w:r>
+        <w:t>an</w:t>
+      </w:r>
       <w:r>
         <w:t xml:space="preserve"> integer or float value, which will </w:t>
       </w:r>
-      <w:proofErr w:type="gramStart"/>
-      <w:r>
-        <w:t>interpreted</w:t>
-      </w:r>
-      <w:proofErr w:type="gramEnd"/>
-      <w:r>
-        <w:t xml:space="preserve"> as an integer. </w:t>
-      </w:r>
-    </w:p>
-    <w:p>
-      <w:r>
-        <w:t xml:space="preserve">This program also tracks the number of buyers who have successfully purchased a ticket or tickets. </w:t>
+      <w:r>
+        <w:t>be interpreted</w:t>
+      </w:r>
+      <w:r>
+        <w:t xml:space="preserve"> as an integer. This program also tracks the number of buyers who have successfully purchased a ticket or tickets. </w:t>
       </w:r>
     </w:p>
     <w:p/>
     <w:p>
       <w:r>
-        <w:t xml:space="preserve">Function: </w:t>
-      </w:r>
-      <w:proofErr w:type="spellStart"/>
-      <w:r>
-        <w:t>ticket_sign</w:t>
-      </w:r>
-      <w:proofErr w:type="spellEnd"/>
-    </w:p>
-    <w:p>
-      <w:r>
-        <w:t>Description:</w:t>
-      </w:r>
-    </w:p>
-    <w:p>
-      <w:r>
-        <w:t xml:space="preserve">Displays the number of tickets available for purchase. </w:t>
-      </w:r>
-    </w:p>
-    <w:p>
-      <w:r>
-        <w:t xml:space="preserve">Determines when to continue to sell tickets or stop when sold out. </w:t>
-      </w:r>
-    </w:p>
-    <w:p>
-      <w:r>
-        <w:t>Once all tickets have been purchased, this function will display the number of buyers who have successfully purchased tickets.</w:t>
-      </w:r>
-    </w:p>
-    <w:p>
-      <w:r>
-        <w:t>Parameters:</w:t>
-      </w:r>
-    </w:p>
-    <w:p>
-      <w:proofErr w:type="spellStart"/>
-      <w:r>
-        <w:t>ticket_supply</w:t>
-      </w:r>
-      <w:proofErr w:type="spellEnd"/>
-      <w:r>
-        <w:t xml:space="preserve">, </w:t>
-      </w:r>
-      <w:proofErr w:type="gramStart"/>
-      <w:r>
-        <w:t>int :</w:t>
-      </w:r>
-      <w:proofErr w:type="gramEnd"/>
-      <w:r>
-        <w:t xml:space="preserve"> Number of tickets remaining. </w:t>
-      </w:r>
-    </w:p>
-    <w:p>
-      <w:r>
-        <w:t>Buyers, int: Number of successful buyers</w:t>
-      </w:r>
-    </w:p>
-    <w:p>
-      <w:r>
-        <w:t>Variables used:</w:t>
-      </w:r>
-    </w:p>
-    <w:p>
-      <w:proofErr w:type="spellStart"/>
-      <w:r>
-        <w:t>ticket_supply</w:t>
-      </w:r>
-      <w:proofErr w:type="spellEnd"/>
-      <w:r>
-        <w:t xml:space="preserve">, int: </w:t>
-      </w:r>
-      <w:r>
-        <w:t>Number of tickets remaining</w:t>
-      </w:r>
-    </w:p>
-    <w:p>
-      <w:proofErr w:type="gramStart"/>
-      <w:r>
-        <w:t>buyers</w:t>
-      </w:r>
-      <w:proofErr w:type="gramEnd"/>
-      <w:r>
-        <w:t xml:space="preserve">, int: </w:t>
-      </w:r>
-      <w:r>
-        <w:t>Number of successful buyers</w:t>
-      </w:r>
-    </w:p>
-    <w:p>
-      <w:r>
-        <w:t>Logic:</w:t>
+        <w:t>Function: ticket_sign</w:t>
       </w:r>
     </w:p>
     <w:p>
@@ -158,16 +53,18 @@
         <w:pStyle w:val="ListParagraph"/>
         <w:numPr>
           <w:ilvl w:val="0"/>
-          <w:numId w:val="1"/>
+          <w:numId w:val="2"/>
         </w:numPr>
       </w:pPr>
-      <w:proofErr w:type="gramStart"/>
-      <w:r>
-        <w:t>Checks</w:t>
-      </w:r>
-      <w:proofErr w:type="gramEnd"/>
-      <w:r>
-        <w:t xml:space="preserve"> if tickets remain available </w:t>
+      <w:r>
+        <w:t>Description:</w:t>
+      </w:r>
+      <w:r>
+        <w:br/>
+        <w:t xml:space="preserve">This is the main function that sets ups the program. This functions initializes the starting amount of tickets. The loop within this function sells tickets until all tickets are sold out. </w:t>
+      </w:r>
+      <w:r>
+        <w:br/>
       </w:r>
     </w:p>
     <w:p>
@@ -175,11 +72,179 @@
         <w:pStyle w:val="ListParagraph"/>
         <w:numPr>
           <w:ilvl w:val="0"/>
-          <w:numId w:val="1"/>
+          <w:numId w:val="2"/>
         </w:numPr>
       </w:pPr>
       <w:r>
-        <w:t>If tickets are available</w:t>
+        <w:t>Parameters:</w:t>
+      </w:r>
+      <w:r>
+        <w:br/>
+        <w:t>none</w:t>
+      </w:r>
+      <w:r>
+        <w:br/>
+      </w:r>
+    </w:p>
+    <w:p>
+      <w:pPr>
+        <w:pStyle w:val="ListParagraph"/>
+        <w:numPr>
+          <w:ilvl w:val="0"/>
+          <w:numId w:val="2"/>
+        </w:numPr>
+      </w:pPr>
+      <w:r>
+        <w:t>Variables used:</w:t>
+      </w:r>
+      <w:r>
+        <w:br/>
+      </w:r>
+      <w:r>
+        <w:t>ticket_supply – Tracks the initial and update count of tickets.</w:t>
+      </w:r>
+      <w:r>
+        <w:br/>
+      </w:r>
+      <w:r>
+        <w:t>Buyers</w:t>
+      </w:r>
+      <w:r>
+        <w:t xml:space="preserve"> – Tracks count of buyers.</w:t>
+      </w:r>
+      <w:r>
+        <w:br/>
+        <w:t>Purchased – Tracks the count of sold tickets.</w:t>
+      </w:r>
+      <w:r>
+        <w:br/>
+      </w:r>
+    </w:p>
+    <w:p>
+      <w:pPr>
+        <w:pStyle w:val="ListParagraph"/>
+        <w:numPr>
+          <w:ilvl w:val="0"/>
+          <w:numId w:val="2"/>
+        </w:numPr>
+      </w:pPr>
+      <w:r>
+        <w:t>Logic:</w:t>
+      </w:r>
+      <w:r>
+        <w:br/>
+        <w:t>Sets the count of tickets to 20 and the buyer count to 0.</w:t>
+      </w:r>
+      <w:r>
+        <w:br/>
+        <w:t xml:space="preserve">Initiates a loop to sell tickets so long as ticket_supply is greater than </w:t>
+      </w:r>
+      <w:r>
+        <w:t>1</w:t>
+      </w:r>
+      <w:r>
+        <w:t>.</w:t>
+      </w:r>
+      <w:r>
+        <w:br/>
+      </w:r>
+      <w:r>
+        <w:br/>
+        <w:t>Calls the buy_a_ticket function and passes it the current ticket supply to set the supply limit.</w:t>
+      </w:r>
+      <w:r>
+        <w:t xml:space="preserve"> The returned result is stored in the purchased variable, which is then subtracted from the total supplier amount and the buyer count is updated. </w:t>
+      </w:r>
+      <w:r>
+        <w:br/>
+      </w:r>
+      <w:r>
+        <w:t>If no tickets are availabl</w:t>
+      </w:r>
+      <w:r>
+        <w:t xml:space="preserve">e. </w:t>
+      </w:r>
+      <w:r>
+        <w:t>Displa</w:t>
+      </w:r>
+      <w:r>
+        <w:t>ys</w:t>
+      </w:r>
+      <w:r>
+        <w:t xml:space="preserve"> a </w:t>
+      </w:r>
+      <w:r>
+        <w:t>sold-out</w:t>
+      </w:r>
+      <w:r>
+        <w:t xml:space="preserve"> messag</w:t>
+      </w:r>
+      <w:r>
+        <w:t>e</w:t>
+      </w:r>
+      <w:r>
+        <w:t xml:space="preserve"> and d</w:t>
+      </w:r>
+      <w:r>
+        <w:t>isplay</w:t>
+      </w:r>
+      <w:r>
+        <w:t xml:space="preserve">s </w:t>
+      </w:r>
+      <w:r>
+        <w:t>the total number of buyers</w:t>
+      </w:r>
+      <w:r>
+        <w:t xml:space="preserve">. </w:t>
+      </w:r>
+      <w:r>
+        <w:t>No return</w:t>
+      </w:r>
+    </w:p>
+    <w:p/>
+    <w:p>
+      <w:r>
+        <w:lastRenderedPageBreak/>
+        <w:t>Function: buy_a_ticket</w:t>
+      </w:r>
+    </w:p>
+    <w:p>
+      <w:pPr>
+        <w:pStyle w:val="ListParagraph"/>
+        <w:numPr>
+          <w:ilvl w:val="0"/>
+          <w:numId w:val="3"/>
+        </w:numPr>
+      </w:pPr>
+      <w:r>
+        <w:t>Description:</w:t>
+      </w:r>
+      <w:r>
+        <w:br/>
+      </w:r>
+      <w:r>
+        <w:t xml:space="preserve">Prompts the user to </w:t>
+      </w:r>
+      <w:r>
+        <w:t xml:space="preserve">enter the number of </w:t>
+      </w:r>
+      <w:r>
+        <w:t>tickets</w:t>
+      </w:r>
+      <w:r>
+        <w:t xml:space="preserve"> they would like to purchase</w:t>
+      </w:r>
+      <w:r>
+        <w:t xml:space="preserve">. Validates </w:t>
+      </w:r>
+      <w:r>
+        <w:t xml:space="preserve">input, and </w:t>
+      </w:r>
+      <w:r>
+        <w:t>verifies it doesn’t violate any purchasing criteria</w:t>
+      </w:r>
+      <w:r>
+        <w:t>:</w:t>
       </w:r>
     </w:p>
     <w:p>
@@ -187,11 +252,11 @@
         <w:pStyle w:val="ListParagraph"/>
         <w:numPr>
           <w:ilvl w:val="1"/>
-          <w:numId w:val="1"/>
+          <w:numId w:val="3"/>
         </w:numPr>
       </w:pPr>
       <w:r>
-        <w:t>Display the remaining ticket count</w:t>
+        <w:t>only positive numbers.</w:t>
       </w:r>
     </w:p>
     <w:p>
@@ -199,19 +264,34 @@
         <w:pStyle w:val="ListParagraph"/>
         <w:numPr>
           <w:ilvl w:val="1"/>
-          <w:numId w:val="1"/>
+          <w:numId w:val="3"/>
         </w:numPr>
       </w:pPr>
       <w:r>
-        <w:t xml:space="preserve">Call the </w:t>
-      </w:r>
-      <w:proofErr w:type="spellStart"/>
-      <w:r>
-        <w:t>buy_a_ticket</w:t>
-      </w:r>
-      <w:proofErr w:type="spellEnd"/>
-      <w:r>
-        <w:t xml:space="preserve"> function</w:t>
+        <w:t>No more than 4 at time.</w:t>
+      </w:r>
+    </w:p>
+    <w:p>
+      <w:pPr>
+        <w:pStyle w:val="ListParagraph"/>
+        <w:numPr>
+          <w:ilvl w:val="1"/>
+          <w:numId w:val="3"/>
+        </w:numPr>
+      </w:pPr>
+      <w:r>
+        <w:t>Ticket supply must meet demand.</w:t>
+      </w:r>
+    </w:p>
+    <w:p>
+      <w:pPr>
+        <w:pStyle w:val="ListParagraph"/>
+      </w:pPr>
+      <w:r>
+        <w:t xml:space="preserve"> </w:t>
+      </w:r>
+      <w:r>
+        <w:br/>
       </w:r>
     </w:p>
     <w:p>
@@ -219,49 +299,26 @@
         <w:pStyle w:val="ListParagraph"/>
         <w:numPr>
           <w:ilvl w:val="0"/>
-          <w:numId w:val="1"/>
+          <w:numId w:val="3"/>
         </w:numPr>
       </w:pPr>
       <w:r>
-        <w:lastRenderedPageBreak/>
-        <w:t>If no tickets are available</w:t>
-      </w:r>
-    </w:p>
-    <w:p>
-      <w:pPr>
-        <w:pStyle w:val="ListParagraph"/>
-        <w:numPr>
-          <w:ilvl w:val="1"/>
-          <w:numId w:val="1"/>
-        </w:numPr>
-      </w:pPr>
-      <w:r>
-        <w:t xml:space="preserve">Display a </w:t>
-      </w:r>
-      <w:proofErr w:type="gramStart"/>
-      <w:r>
-        <w:t>sold out</w:t>
-      </w:r>
-      <w:proofErr w:type="gramEnd"/>
-      <w:r>
-        <w:t xml:space="preserve"> message</w:t>
-      </w:r>
-    </w:p>
-    <w:p>
-      <w:pPr>
-        <w:pStyle w:val="ListParagraph"/>
-        <w:numPr>
-          <w:ilvl w:val="1"/>
-          <w:numId w:val="1"/>
-        </w:numPr>
-      </w:pPr>
-      <w:proofErr w:type="gramStart"/>
-      <w:r>
-        <w:t>Display</w:t>
-      </w:r>
-      <w:proofErr w:type="gramEnd"/>
-      <w:r>
-        <w:t xml:space="preserve"> the total number of buyers</w:t>
+        <w:t>Parameters:</w:t>
+      </w:r>
+      <w:r>
+        <w:br/>
+      </w:r>
+      <w:r>
+        <w:t>ticket_supply</w:t>
+      </w:r>
+      <w:r>
+        <w:t xml:space="preserve"> - </w:t>
+      </w:r>
+      <w:r>
+        <w:t xml:space="preserve">Number of tickets remaining. </w:t>
+      </w:r>
+      <w:r>
+        <w:br/>
       </w:r>
     </w:p>
     <w:p>
@@ -269,103 +326,29 @@
         <w:pStyle w:val="ListParagraph"/>
         <w:numPr>
           <w:ilvl w:val="0"/>
-          <w:numId w:val="1"/>
+          <w:numId w:val="3"/>
         </w:numPr>
       </w:pPr>
       <w:r>
-        <w:t>No return</w:t>
-      </w:r>
-    </w:p>
-    <w:p/>
-    <w:p>
-      <w:r>
-        <w:t xml:space="preserve">Function: </w:t>
-      </w:r>
-      <w:proofErr w:type="spellStart"/>
-      <w:r>
-        <w:t>buy_a_ticket</w:t>
-      </w:r>
-      <w:proofErr w:type="spellEnd"/>
-    </w:p>
-    <w:p/>
-    <w:p>
-      <w:r>
-        <w:t>Description:</w:t>
-      </w:r>
-    </w:p>
-    <w:p>
-      <w:r>
-        <w:t>Prompts the user to purchase a ticket or tickets. Validates input, updates tickets count and records successful purchases.</w:t>
-      </w:r>
-    </w:p>
-    <w:p/>
-    <w:p>
-      <w:r>
-        <w:t>Parameters:</w:t>
-      </w:r>
-    </w:p>
-    <w:p>
-      <w:proofErr w:type="spellStart"/>
-      <w:r>
-        <w:t>ticket_supply</w:t>
-      </w:r>
-      <w:proofErr w:type="spellEnd"/>
-      <w:r>
-        <w:t xml:space="preserve">, </w:t>
-      </w:r>
-      <w:proofErr w:type="gramStart"/>
-      <w:r>
-        <w:t>int :</w:t>
-      </w:r>
-      <w:proofErr w:type="gramEnd"/>
-      <w:r>
-        <w:t xml:space="preserve"> Number of tickets remaining. </w:t>
-      </w:r>
-    </w:p>
-    <w:p>
-      <w:r>
-        <w:t>Buyers, int: Number of successful buyers</w:t>
-      </w:r>
-    </w:p>
-    <w:p>
-      <w:r>
         <w:t>Variables used:</w:t>
       </w:r>
-    </w:p>
-    <w:p>
-      <w:proofErr w:type="spellStart"/>
+      <w:r>
+        <w:t xml:space="preserve"> </w:t>
+      </w:r>
+      <w:r>
+        <w:br/>
+      </w:r>
       <w:r>
         <w:t>ticket_to_buy</w:t>
       </w:r>
-      <w:proofErr w:type="spellEnd"/>
-      <w:r>
-        <w:t>, in: Number of tickets requested from buyer.</w:t>
-      </w:r>
-    </w:p>
-    <w:p>
-      <w:proofErr w:type="spellStart"/>
-      <w:r>
-        <w:t>ticket_supply</w:t>
-      </w:r>
-      <w:proofErr w:type="spellEnd"/>
-      <w:r>
-        <w:t>, int: Number of tickets remaining</w:t>
-      </w:r>
-    </w:p>
-    <w:p>
-      <w:proofErr w:type="gramStart"/>
-      <w:r>
-        <w:t>buyers</w:t>
-      </w:r>
-      <w:proofErr w:type="gramEnd"/>
-      <w:r>
-        <w:t>, int: Number of successful buyers</w:t>
-      </w:r>
-    </w:p>
-    <w:p/>
-    <w:p>
-      <w:r>
-        <w:t>Logic:</w:t>
+      <w:r>
+        <w:t xml:space="preserve"> - N</w:t>
+      </w:r>
+      <w:r>
+        <w:t>umber of tickets requested from buyer.</w:t>
+      </w:r>
+      <w:r>
+        <w:br/>
       </w:r>
     </w:p>
     <w:p>
@@ -373,182 +356,102 @@
         <w:pStyle w:val="ListParagraph"/>
         <w:numPr>
           <w:ilvl w:val="0"/>
-          <w:numId w:val="1"/>
+          <w:numId w:val="3"/>
         </w:numPr>
       </w:pPr>
       <w:r>
+        <w:t>Logic:</w:t>
+      </w:r>
+      <w:r>
+        <w:br/>
+      </w:r>
+      <w:r>
         <w:t>Start a loop that will only break when a valid input (int) is received.</w:t>
       </w:r>
+      <w:r>
+        <w:t xml:space="preserve"> </w:t>
+      </w:r>
+      <w:r>
+        <w:br/>
+      </w:r>
+      <w:r>
+        <w:br/>
+      </w:r>
+      <w:r>
+        <w:t xml:space="preserve">Prompt the user </w:t>
+      </w:r>
+      <w:r>
+        <w:t>to enter</w:t>
+      </w:r>
+      <w:r>
+        <w:t xml:space="preserve"> the</w:t>
+      </w:r>
+      <w:r>
+        <w:t xml:space="preserve"> number of tickets </w:t>
+      </w:r>
+      <w:r>
+        <w:t xml:space="preserve">they are wanting to </w:t>
+      </w:r>
+      <w:r>
+        <w:t>purchase.</w:t>
+      </w:r>
+      <w:r>
+        <w:t xml:space="preserve"> </w:t>
+      </w:r>
+      <w:r>
+        <w:br/>
+      </w:r>
+      <w:r>
+        <w:br/>
+      </w:r>
+      <w:r>
+        <w:t>Convert input to int</w:t>
+      </w:r>
+      <w:r>
+        <w:t xml:space="preserve">, </w:t>
+      </w:r>
+      <w:r>
+        <w:t>if</w:t>
+      </w:r>
+      <w:r>
+        <w:t xml:space="preserve"> conversion fails</w:t>
+      </w:r>
+      <w:r>
+        <w:t xml:space="preserve"> due to type/value error, an error message is displayed and the loop restarts. </w:t>
+      </w:r>
+      <w:r>
+        <w:br/>
+      </w:r>
+      <w:r>
+        <w:br/>
+        <w:t xml:space="preserve">Uses if statement to check if the number of tickets the user wants to purchase is over 4, under 1, or if there are any tickets available for the amount they want to purchase. </w:t>
+      </w:r>
+      <w:r>
+        <w:br/>
+      </w:r>
+      <w:r>
+        <w:br/>
+      </w:r>
+      <w:r>
+        <w:t>If all input is valid</w:t>
+      </w:r>
+      <w:r>
+        <w:t xml:space="preserve">, a </w:t>
+      </w:r>
+      <w:r>
+        <w:t>purchase confirmation</w:t>
+      </w:r>
+      <w:r>
+        <w:t xml:space="preserve"> message is </w:t>
+      </w:r>
+      <w:r>
+        <w:t xml:space="preserve">displayed, and ticket_to_buy is returned back to the main function. </w:t>
+      </w:r>
     </w:p>
     <w:p>
       <w:pPr>
         <w:pStyle w:val="ListParagraph"/>
-        <w:numPr>
-          <w:ilvl w:val="0"/>
-          <w:numId w:val="1"/>
-        </w:numPr>
-      </w:pPr>
-      <w:r>
-        <w:t xml:space="preserve">Prompt the user for </w:t>
-      </w:r>
-      <w:proofErr w:type="gramStart"/>
-      <w:r>
-        <w:t>a number of</w:t>
-      </w:r>
-      <w:proofErr w:type="gramEnd"/>
-      <w:r>
-        <w:t xml:space="preserve"> tickets to purchase.</w:t>
-      </w:r>
-    </w:p>
-    <w:p>
-      <w:pPr>
-        <w:pStyle w:val="ListParagraph"/>
-        <w:numPr>
-          <w:ilvl w:val="0"/>
-          <w:numId w:val="1"/>
-        </w:numPr>
-      </w:pPr>
-      <w:r>
-        <w:t>Convert input to int</w:t>
-      </w:r>
-    </w:p>
-    <w:p>
-      <w:pPr>
-        <w:pStyle w:val="ListParagraph"/>
-        <w:numPr>
-          <w:ilvl w:val="0"/>
-          <w:numId w:val="1"/>
-        </w:numPr>
-      </w:pPr>
-      <w:r>
-        <w:t>If conversion fails, display an error message and continue loop</w:t>
-      </w:r>
-    </w:p>
-    <w:p>
-      <w:pPr>
-        <w:pStyle w:val="ListParagraph"/>
-        <w:numPr>
-          <w:ilvl w:val="0"/>
-          <w:numId w:val="1"/>
-        </w:numPr>
-      </w:pPr>
-      <w:r>
-        <w:t>Restrict max ticket purchases per buyer to 4</w:t>
-      </w:r>
-    </w:p>
-    <w:p>
-      <w:pPr>
-        <w:pStyle w:val="ListParagraph"/>
-        <w:numPr>
-          <w:ilvl w:val="0"/>
-          <w:numId w:val="1"/>
-        </w:numPr>
-      </w:pPr>
-      <w:r>
-        <w:t xml:space="preserve">Only sell available tickets to </w:t>
-      </w:r>
-      <w:proofErr w:type="gramStart"/>
-      <w:r>
-        <w:t>buyer</w:t>
-      </w:r>
-      <w:proofErr w:type="gramEnd"/>
-    </w:p>
-    <w:p>
-      <w:pPr>
-        <w:pStyle w:val="ListParagraph"/>
-        <w:numPr>
-          <w:ilvl w:val="0"/>
-          <w:numId w:val="1"/>
-        </w:numPr>
-      </w:pPr>
-      <w:r>
-        <w:t>If all input is valid</w:t>
-      </w:r>
-    </w:p>
-    <w:p>
-      <w:pPr>
-        <w:pStyle w:val="ListParagraph"/>
-        <w:numPr>
-          <w:ilvl w:val="1"/>
-          <w:numId w:val="1"/>
-        </w:numPr>
-      </w:pPr>
-      <w:r>
-        <w:t>Display purchase confirmation</w:t>
-      </w:r>
-    </w:p>
-    <w:p>
-      <w:pPr>
-        <w:pStyle w:val="ListParagraph"/>
-        <w:numPr>
-          <w:ilvl w:val="1"/>
-          <w:numId w:val="1"/>
-        </w:numPr>
-      </w:pPr>
-      <w:r>
-        <w:t xml:space="preserve">Update ticket supply, subtracting tickets sold from current </w:t>
-      </w:r>
-      <w:proofErr w:type="gramStart"/>
-      <w:r>
-        <w:t>buyers</w:t>
-      </w:r>
-      <w:proofErr w:type="gramEnd"/>
-      <w:r>
-        <w:t xml:space="preserve"> purchase.</w:t>
-      </w:r>
-    </w:p>
-    <w:p>
-      <w:pPr>
-        <w:pStyle w:val="ListParagraph"/>
-        <w:numPr>
-          <w:ilvl w:val="1"/>
-          <w:numId w:val="1"/>
-        </w:numPr>
-      </w:pPr>
-      <w:r>
-        <w:t>Increment buyer count</w:t>
-      </w:r>
-    </w:p>
-    <w:p>
-      <w:pPr>
-        <w:pStyle w:val="ListParagraph"/>
-        <w:numPr>
-          <w:ilvl w:val="1"/>
-          <w:numId w:val="1"/>
-        </w:numPr>
-      </w:pPr>
-      <w:r>
-        <w:lastRenderedPageBreak/>
-        <w:t xml:space="preserve">Call </w:t>
-      </w:r>
-      <w:proofErr w:type="spellStart"/>
-      <w:r>
-        <w:t>ticket_sign</w:t>
-      </w:r>
-      <w:proofErr w:type="spellEnd"/>
-      <w:r>
-        <w:t xml:space="preserve"> again with updated </w:t>
-      </w:r>
-      <w:proofErr w:type="spellStart"/>
-      <w:r>
-        <w:t>ticket_supply</w:t>
-      </w:r>
-      <w:proofErr w:type="spellEnd"/>
-      <w:r>
-        <w:t xml:space="preserve"> count. </w:t>
-      </w:r>
-    </w:p>
-    <w:p>
-      <w:pPr>
-        <w:pStyle w:val="ListParagraph"/>
-        <w:numPr>
-          <w:ilvl w:val="0"/>
-          <w:numId w:val="1"/>
-        </w:numPr>
-      </w:pPr>
-      <w:r>
-        <w:t>No returns</w:t>
-      </w:r>
+      </w:pPr>
     </w:p>
     <w:p>
       <w:r>
@@ -575,10 +478,10 @@
       <w:r>
         <w:lastRenderedPageBreak/>
         <w:drawing>
-          <wp:inline distT="0" distB="0" distL="0" distR="0" wp14:anchorId="40E2B665" wp14:editId="39BFE4CC">
-            <wp:extent cx="5943600" cy="7415530"/>
-            <wp:effectExtent l="0" t="0" r="0" b="0"/>
-            <wp:docPr id="2143607202" name="Picture 1" descr="A Python code snippet for a ticket buying system that validates input, restricts purchase to one or more tickets, and displays remaining tickets and total buyers.&#10;&#10;AI-generated content may be incorrect."/>
+          <wp:inline distT="0" distB="0" distL="0" distR="0" wp14:anchorId="452EDA89" wp14:editId="7B934040">
+            <wp:extent cx="5686425" cy="8229600"/>
+            <wp:effectExtent l="0" t="0" r="9525" b="0"/>
+            <wp:docPr id="290363538" name="Picture 1" descr="An IPython code snippet displaying a simple ticket purchasing system, where the user is prompted to buy tickets, with input validation and a maximum purchase limit.&#10;&#10;AI-generated content may be incorrect."/>
             <wp:cNvGraphicFramePr>
               <a:graphicFrameLocks xmlns:a="http://schemas.openxmlformats.org/drawingml/2006/main" noChangeAspect="1"/>
             </wp:cNvGraphicFramePr>
@@ -586,7 +489,7 @@
               <a:graphicData uri="http://schemas.openxmlformats.org/drawingml/2006/picture">
                 <pic:pic xmlns:pic="http://schemas.openxmlformats.org/drawingml/2006/picture">
                   <pic:nvPicPr>
-                    <pic:cNvPr id="2143607202" name="Picture 1" descr="A Python code snippet for a ticket buying system that validates input, restricts purchase to one or more tickets, and displays remaining tickets and total buyers.&#10;&#10;AI-generated content may be incorrect."/>
+                    <pic:cNvPr id="290363538" name="Picture 1" descr="An IPython code snippet displaying a simple ticket purchasing system, where the user is prompted to buy tickets, with input validation and a maximum purchase limit.&#10;&#10;AI-generated content may be incorrect."/>
                     <pic:cNvPicPr/>
                   </pic:nvPicPr>
                   <pic:blipFill>
@@ -598,7 +501,7 @@
                   <pic:spPr>
                     <a:xfrm>
                       <a:off x="0" y="0"/>
-                      <a:ext cx="5943600" cy="7415530"/>
+                      <a:ext cx="5686425" cy="8229600"/>
                     </a:xfrm>
                     <a:prstGeom prst="rect">
                       <a:avLst/>
@@ -625,6 +528,119 @@
 <file path=word/numbering.xml><?xml version="1.0" encoding="utf-8"?>
 <w:numbering xmlns:wpc="http://schemas.microsoft.com/office/word/2010/wordprocessingCanvas" xmlns:cx="http://schemas.microsoft.com/office/drawing/2014/chartex" xmlns:cx1="http://schemas.microsoft.com/office/drawing/2015/9/8/chartex" xmlns:cx2="http://schemas.microsoft.com/office/drawing/2015/10/21/chartex" xmlns:cx3="http://schemas.microsoft.com/office/drawing/2016/5/9/chartex" xmlns:cx4="http://schemas.microsoft.com/office/drawing/2016/5/10/chartex" xmlns:cx5="http://schemas.microsoft.com/office/drawing/2016/5/11/chartex" xmlns:cx6="http://schemas.microsoft.com/office/drawing/2016/5/12/chartex" xmlns:cx7="http://schemas.microsoft.com/office/drawing/2016/5/13/chartex" xmlns:cx8="http://schemas.microsoft.com/office/drawing/2016/5/14/chartex" xmlns:mc="http://schemas.openxmlformats.org/markup-compatibility/2006" xmlns:aink="http://schemas.microsoft.com/office/drawing/2016/ink" xmlns:am3d="http://schemas.microsoft.com/office/drawing/2017/model3d" xmlns:o="urn:schemas-microsoft-com:office:office" xmlns:oel="http://schemas.microsoft.com/office/2019/extlst" xmlns:r="http://schemas.openxmlformats.org/officeDocument/2006/relationships" xmlns:m="http://schemas.openxmlformats.org/officeDocument/2006/math" xmlns:v="urn:schemas-microsoft-com:vml" xmlns:wp14="http://schemas.microsoft.com/office/word/2010/wordprocessingDrawing" xmlns:wp="http://schemas.openxmlformats.org/drawingml/2006/wordprocessingDrawing" xmlns:w10="urn:schemas-microsoft-com:office:word" xmlns:w="http://schemas.openxmlformats.org/wordprocessingml/2006/main" xmlns:w14="http://schemas.microsoft.com/office/word/2010/wordml" xmlns:w15="http://schemas.microsoft.com/office/word/2012/wordml" xmlns:w16cex="http://schemas.microsoft.com/office/word/2018/wordml/cex" xmlns:w16cid="http://schemas.microsoft.com/office/word/2016/wordml/cid" xmlns:w16="http://schemas.microsoft.com/office/word/2018/wordml" xmlns:w16du="http://schemas.microsoft.com/office/word/2023/wordml/word16du" xmlns:w16sdtdh="http://schemas.microsoft.com/office/word/2020/wordml/sdtdatahash" xmlns:w16sdtfl="http://schemas.microsoft.com/office/word/2024/wordml/sdtformatlock" xmlns:w16se="http://schemas.microsoft.com/office/word/2015/wordml/symex" xmlns:wpg="http://schemas.microsoft.com/office/word/2010/wordprocessingGroup" xmlns:wpi="http://schemas.microsoft.com/office/word/2010/wordprocessingInk" xmlns:wne="http://schemas.microsoft.com/office/word/2006/wordml" xmlns:wps="http://schemas.microsoft.com/office/word/2010/wordprocessingShape" mc:Ignorable="w14 w15 w16se w16cid w16 w16cex w16sdtdh w16sdtfl w16du wp14">
   <w:abstractNum w:abstractNumId="0" w15:restartNumberingAfterBreak="0">
+    <w:nsid w:val="45FB7177"/>
+    <w:multiLevelType w:val="hybridMultilevel"/>
+    <w:tmpl w:val="ADC847D4"/>
+    <w:lvl w:ilvl="0" w:tplc="04090001">
+      <w:start w:val="1"/>
+      <w:numFmt w:val="bullet"/>
+      <w:lvlText w:val=""/>
+      <w:lvlJc w:val="left"/>
+      <w:pPr>
+        <w:ind w:left="720" w:hanging="360"/>
+      </w:pPr>
+      <w:rPr>
+        <w:rFonts w:ascii="Symbol" w:hAnsi="Symbol" w:hint="default"/>
+      </w:rPr>
+    </w:lvl>
+    <w:lvl w:ilvl="1" w:tplc="04090003">
+      <w:start w:val="1"/>
+      <w:numFmt w:val="bullet"/>
+      <w:lvlText w:val="o"/>
+      <w:lvlJc w:val="left"/>
+      <w:pPr>
+        <w:ind w:left="1440" w:hanging="360"/>
+      </w:pPr>
+      <w:rPr>
+        <w:rFonts w:ascii="Courier New" w:hAnsi="Courier New" w:cs="Courier New" w:hint="default"/>
+      </w:rPr>
+    </w:lvl>
+    <w:lvl w:ilvl="2" w:tplc="04090005" w:tentative="1">
+      <w:start w:val="1"/>
+      <w:numFmt w:val="bullet"/>
+      <w:lvlText w:val=""/>
+      <w:lvlJc w:val="left"/>
+      <w:pPr>
+        <w:ind w:left="2160" w:hanging="360"/>
+      </w:pPr>
+      <w:rPr>
+        <w:rFonts w:ascii="Wingdings" w:hAnsi="Wingdings" w:hint="default"/>
+      </w:rPr>
+    </w:lvl>
+    <w:lvl w:ilvl="3" w:tplc="04090001" w:tentative="1">
+      <w:start w:val="1"/>
+      <w:numFmt w:val="bullet"/>
+      <w:lvlText w:val=""/>
+      <w:lvlJc w:val="left"/>
+      <w:pPr>
+        <w:ind w:left="2880" w:hanging="360"/>
+      </w:pPr>
+      <w:rPr>
+        <w:rFonts w:ascii="Symbol" w:hAnsi="Symbol" w:hint="default"/>
+      </w:rPr>
+    </w:lvl>
+    <w:lvl w:ilvl="4" w:tplc="04090003" w:tentative="1">
+      <w:start w:val="1"/>
+      <w:numFmt w:val="bullet"/>
+      <w:lvlText w:val="o"/>
+      <w:lvlJc w:val="left"/>
+      <w:pPr>
+        <w:ind w:left="3600" w:hanging="360"/>
+      </w:pPr>
+      <w:rPr>
+        <w:rFonts w:ascii="Courier New" w:hAnsi="Courier New" w:cs="Courier New" w:hint="default"/>
+      </w:rPr>
+    </w:lvl>
+    <w:lvl w:ilvl="5" w:tplc="04090005" w:tentative="1">
+      <w:start w:val="1"/>
+      <w:numFmt w:val="bullet"/>
+      <w:lvlText w:val=""/>
+      <w:lvlJc w:val="left"/>
+      <w:pPr>
+        <w:ind w:left="4320" w:hanging="360"/>
+      </w:pPr>
+      <w:rPr>
+        <w:rFonts w:ascii="Wingdings" w:hAnsi="Wingdings" w:hint="default"/>
+      </w:rPr>
+    </w:lvl>
+    <w:lvl w:ilvl="6" w:tplc="04090001" w:tentative="1">
+      <w:start w:val="1"/>
+      <w:numFmt w:val="bullet"/>
+      <w:lvlText w:val=""/>
+      <w:lvlJc w:val="left"/>
+      <w:pPr>
+        <w:ind w:left="5040" w:hanging="360"/>
+      </w:pPr>
+      <w:rPr>
+        <w:rFonts w:ascii="Symbol" w:hAnsi="Symbol" w:hint="default"/>
+      </w:rPr>
+    </w:lvl>
+    <w:lvl w:ilvl="7" w:tplc="04090003" w:tentative="1">
+      <w:start w:val="1"/>
+      <w:numFmt w:val="bullet"/>
+      <w:lvlText w:val="o"/>
+      <w:lvlJc w:val="left"/>
+      <w:pPr>
+        <w:ind w:left="5760" w:hanging="360"/>
+      </w:pPr>
+      <w:rPr>
+        <w:rFonts w:ascii="Courier New" w:hAnsi="Courier New" w:cs="Courier New" w:hint="default"/>
+      </w:rPr>
+    </w:lvl>
+    <w:lvl w:ilvl="8" w:tplc="04090005" w:tentative="1">
+      <w:start w:val="1"/>
+      <w:numFmt w:val="bullet"/>
+      <w:lvlText w:val=""/>
+      <w:lvlJc w:val="left"/>
+      <w:pPr>
+        <w:ind w:left="6480" w:hanging="360"/>
+      </w:pPr>
+      <w:rPr>
+        <w:rFonts w:ascii="Wingdings" w:hAnsi="Wingdings" w:hint="default"/>
+      </w:rPr>
+    </w:lvl>
+  </w:abstractNum>
+  <w:abstractNum w:abstractNumId="1" w15:restartNumberingAfterBreak="0">
     <w:nsid w:val="6B531DC4"/>
     <w:multiLevelType w:val="hybridMultilevel"/>
     <w:tmpl w:val="EE5248E4"/>
@@ -736,8 +752,127 @@
       </w:rPr>
     </w:lvl>
   </w:abstractNum>
+  <w:abstractNum w:abstractNumId="2" w15:restartNumberingAfterBreak="0">
+    <w:nsid w:val="7F511B45"/>
+    <w:multiLevelType w:val="hybridMultilevel"/>
+    <w:tmpl w:val="09E62A32"/>
+    <w:lvl w:ilvl="0" w:tplc="04090001">
+      <w:start w:val="1"/>
+      <w:numFmt w:val="bullet"/>
+      <w:lvlText w:val=""/>
+      <w:lvlJc w:val="left"/>
+      <w:pPr>
+        <w:ind w:left="720" w:hanging="360"/>
+      </w:pPr>
+      <w:rPr>
+        <w:rFonts w:ascii="Symbol" w:hAnsi="Symbol" w:hint="default"/>
+      </w:rPr>
+    </w:lvl>
+    <w:lvl w:ilvl="1" w:tplc="04090003">
+      <w:start w:val="1"/>
+      <w:numFmt w:val="bullet"/>
+      <w:lvlText w:val="o"/>
+      <w:lvlJc w:val="left"/>
+      <w:pPr>
+        <w:ind w:left="1440" w:hanging="360"/>
+      </w:pPr>
+      <w:rPr>
+        <w:rFonts w:ascii="Courier New" w:hAnsi="Courier New" w:cs="Courier New" w:hint="default"/>
+      </w:rPr>
+    </w:lvl>
+    <w:lvl w:ilvl="2" w:tplc="04090005" w:tentative="1">
+      <w:start w:val="1"/>
+      <w:numFmt w:val="bullet"/>
+      <w:lvlText w:val=""/>
+      <w:lvlJc w:val="left"/>
+      <w:pPr>
+        <w:ind w:left="2160" w:hanging="360"/>
+      </w:pPr>
+      <w:rPr>
+        <w:rFonts w:ascii="Wingdings" w:hAnsi="Wingdings" w:hint="default"/>
+      </w:rPr>
+    </w:lvl>
+    <w:lvl w:ilvl="3" w:tplc="04090001" w:tentative="1">
+      <w:start w:val="1"/>
+      <w:numFmt w:val="bullet"/>
+      <w:lvlText w:val=""/>
+      <w:lvlJc w:val="left"/>
+      <w:pPr>
+        <w:ind w:left="2880" w:hanging="360"/>
+      </w:pPr>
+      <w:rPr>
+        <w:rFonts w:ascii="Symbol" w:hAnsi="Symbol" w:hint="default"/>
+      </w:rPr>
+    </w:lvl>
+    <w:lvl w:ilvl="4" w:tplc="04090003" w:tentative="1">
+      <w:start w:val="1"/>
+      <w:numFmt w:val="bullet"/>
+      <w:lvlText w:val="o"/>
+      <w:lvlJc w:val="left"/>
+      <w:pPr>
+        <w:ind w:left="3600" w:hanging="360"/>
+      </w:pPr>
+      <w:rPr>
+        <w:rFonts w:ascii="Courier New" w:hAnsi="Courier New" w:cs="Courier New" w:hint="default"/>
+      </w:rPr>
+    </w:lvl>
+    <w:lvl w:ilvl="5" w:tplc="04090005" w:tentative="1">
+      <w:start w:val="1"/>
+      <w:numFmt w:val="bullet"/>
+      <w:lvlText w:val=""/>
+      <w:lvlJc w:val="left"/>
+      <w:pPr>
+        <w:ind w:left="4320" w:hanging="360"/>
+      </w:pPr>
+      <w:rPr>
+        <w:rFonts w:ascii="Wingdings" w:hAnsi="Wingdings" w:hint="default"/>
+      </w:rPr>
+    </w:lvl>
+    <w:lvl w:ilvl="6" w:tplc="04090001" w:tentative="1">
+      <w:start w:val="1"/>
+      <w:numFmt w:val="bullet"/>
+      <w:lvlText w:val=""/>
+      <w:lvlJc w:val="left"/>
+      <w:pPr>
+        <w:ind w:left="5040" w:hanging="360"/>
+      </w:pPr>
+      <w:rPr>
+        <w:rFonts w:ascii="Symbol" w:hAnsi="Symbol" w:hint="default"/>
+      </w:rPr>
+    </w:lvl>
+    <w:lvl w:ilvl="7" w:tplc="04090003" w:tentative="1">
+      <w:start w:val="1"/>
+      <w:numFmt w:val="bullet"/>
+      <w:lvlText w:val="o"/>
+      <w:lvlJc w:val="left"/>
+      <w:pPr>
+        <w:ind w:left="5760" w:hanging="360"/>
+      </w:pPr>
+      <w:rPr>
+        <w:rFonts w:ascii="Courier New" w:hAnsi="Courier New" w:cs="Courier New" w:hint="default"/>
+      </w:rPr>
+    </w:lvl>
+    <w:lvl w:ilvl="8" w:tplc="04090005" w:tentative="1">
+      <w:start w:val="1"/>
+      <w:numFmt w:val="bullet"/>
+      <w:lvlText w:val=""/>
+      <w:lvlJc w:val="left"/>
+      <w:pPr>
+        <w:ind w:left="6480" w:hanging="360"/>
+      </w:pPr>
+      <w:rPr>
+        <w:rFonts w:ascii="Wingdings" w:hAnsi="Wingdings" w:hint="default"/>
+      </w:rPr>
+    </w:lvl>
+  </w:abstractNum>
   <w:num w:numId="1" w16cid:durableId="122627083">
+    <w:abstractNumId w:val="1"/>
+  </w:num>
+  <w:num w:numId="2" w16cid:durableId="849485096">
     <w:abstractNumId w:val="0"/>
+  </w:num>
+  <w:num w:numId="3" w16cid:durableId="1225262766">
+    <w:abstractNumId w:val="2"/>
   </w:num>
 </w:numbering>
 </file>
@@ -1346,6 +1481,7 @@
   <w:style w:type="character" w:default="1" w:styleId="DefaultParagraphFont">
     <w:name w:val="Default Paragraph Font"/>
     <w:uiPriority w:val="1"/>
+    <w:semiHidden/>
     <w:unhideWhenUsed/>
   </w:style>
   <w:style w:type="table" w:default="1" w:styleId="TableNormal">

</xml_diff>